<commit_message>
sửa file bao cao
</commit_message>
<xml_diff>
--- a/reports/Nhom-HomeCredit-tailieubaocao.docx
+++ b/reports/Nhom-HomeCredit-tailieubaocao.docx
@@ -679,7 +679,7 @@
               </wp:anchor>
             </w:drawing>
           </mc:Choice>
-          <mc:Fallback xmlns:w16sdtfl="http://schemas.microsoft.com/office/word/2024/wordml/sdtformatlock" xmlns:w16du="http://schemas.microsoft.com/office/word/2023/wordml/word16du">
+          <mc:Fallback xmlns:w16du="http://schemas.microsoft.com/office/word/2023/wordml/word16du" xmlns:w16sdtfl="http://schemas.microsoft.com/office/word/2024/wordml/sdtformatlock">
             <w:pict>
               <v:shape w14:anchorId="04DAE31C" id="FreeForm 21" o:spid="_x0000_s1026" style="position:absolute;margin-left:428.35pt;margin-top:3.75pt;width:22.65pt;height:20.2pt;rotation:-90;z-index:251654656;visibility:visible;mso-wrap-style:square;mso-width-percent:0;mso-height-percent:0;mso-wrap-distance-left:9pt;mso-wrap-distance-top:0;mso-wrap-distance-right:9pt;mso-wrap-distance-bottom:0;mso-position-horizontal:absolute;mso-position-horizontal-relative:text;mso-position-vertical:absolute;mso-position-vertical-relative:text;mso-width-percent:0;mso-height-percent:0;mso-width-relative:page;mso-height-relative:page;v-text-anchor:top" coordsize="263,613" o:gfxdata="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" path="m,19l16,56r32,74l128,316r79,186l239,576r16,37l263,594r,-37l239,390r,-74l247,260r,-18l239,242,191,223,136,167,72,93,24,19,,,,19xe" strokecolor="white" strokeweight="1.5pt">
                 <v:path arrowok="t" o:connecttype="custom" o:connectlocs="0,3327487;19140542,9807947;57421625,22768448;153123241,55344843;247629393,87921238;285910476,100881739;305051018,107361781;314621289,104034294;314621289,97553834;285910476,68305344;285910476,55344843;295480747,45536896;295480747,42384342;285910476,42384342;228488851,39056436;162693512,29248489;86132438,16287988;28710813,3327487;0,0;0,3327487" o:connectangles="0,0,0,0,0,0,0,0,0,0,0,0,0,0,0,0,0,0,0,0"/>
@@ -899,7 +899,7 @@
               </wp:anchor>
             </w:drawing>
           </mc:Choice>
-          <mc:Fallback xmlns:w16sdtfl="http://schemas.microsoft.com/office/word/2024/wordml/sdtformatlock" xmlns:w16du="http://schemas.microsoft.com/office/word/2023/wordml/word16du">
+          <mc:Fallback xmlns:w16du="http://schemas.microsoft.com/office/word/2023/wordml/word16du" xmlns:w16sdtfl="http://schemas.microsoft.com/office/word/2024/wordml/sdtformatlock">
             <w:pict>
               <v:shape w14:anchorId="62480848" id="FreeForm 20" o:spid="_x0000_s1026" style="position:absolute;margin-left:421.35pt;margin-top:7.6pt;width:14.45pt;height:3.05pt;rotation:-90;z-index:251653632;visibility:visible;mso-wrap-style:square;mso-width-percent:0;mso-height-percent:0;mso-wrap-distance-left:9pt;mso-wrap-distance-top:0;mso-wrap-distance-right:9pt;mso-wrap-distance-bottom:0;mso-position-horizontal:absolute;mso-position-horizontal-relative:text;mso-position-vertical:absolute;mso-position-vertical-relative:text;mso-width-percent:0;mso-height-percent:0;mso-width-relative:page;mso-height-relative:page;v-text-anchor:top" coordsize="167,93" o:gfxdata="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" path="m8,56r32,l71,18,87,r16,l159,74r8,l151,93,103,56r-16,l56,93,16,74,,56r8,xe" strokecolor="white" strokeweight="1.5pt">
                 <v:path arrowok="t" o:connecttype="custom" o:connectlocs="9660361,9714571;48302906,9714571;85736670,3122541;105058491,0;124379214,0;192002843,12837112;201663205,12837112;182342482,16133336;124379214,9714571;105058491,9714571;67623629,16133336;19320723,12837112;0,9714571;0,9714571;9660361,9714571" o:connectangles="0,0,0,0,0,0,0,0,0,0,0,0,0,0,0"/>
@@ -1167,7 +1167,7 @@
               </wp:anchor>
             </w:drawing>
           </mc:Choice>
-          <mc:Fallback xmlns:w16sdtfl="http://schemas.microsoft.com/office/word/2024/wordml/sdtformatlock" xmlns:w16du="http://schemas.microsoft.com/office/word/2023/wordml/word16du">
+          <mc:Fallback xmlns:w16du="http://schemas.microsoft.com/office/word/2023/wordml/word16du" xmlns:w16sdtfl="http://schemas.microsoft.com/office/word/2024/wordml/sdtformatlock">
             <w:pict>
               <v:shape w14:anchorId="151C1FF4" id="FreeForm 19" o:spid="_x0000_s1026" style="position:absolute;margin-left:10.25pt;margin-top:3.85pt;width:22.65pt;height:20.25pt;rotation:-90;z-index:251647488;visibility:visible;mso-wrap-style:square;mso-width-percent:0;mso-height-percent:0;mso-wrap-distance-left:9pt;mso-wrap-distance-top:0;mso-wrap-distance-right:9pt;mso-wrap-distance-bottom:0;mso-position-horizontal:absolute;mso-position-horizontal-relative:text;mso-position-vertical:absolute;mso-position-vertical-relative:text;mso-width-percent:0;mso-height-percent:0;mso-width-relative:page;mso-height-relative:page;v-text-anchor:top" coordsize="263,613" o:gfxdata="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" path="m,595l16,576,48,502,128,316,207,112,239,38,255,r8,19l263,75,239,223r,75l247,372r,18l239,390r-48,l136,446,72,520,24,595,,613,,595xe" strokecolor="white" strokeweight="1.5pt">
                 <v:path arrowok="t" o:connecttype="custom" o:connectlocs="0,104725604;19140542,101381490;57421625,88357023;153123241,55619023;247629393,19713114;285910476,6688228;305051018,0;314621289,3344114;314621289,13200671;285910476,39250023;285910476,52450694;295480747,65475580;295480747,68643909;285910476,68643909;228488851,68643909;162693512,78500466;86132438,91524933;28710813,104725604;0,107893933;0,104725604" o:connectangles="0,0,0,0,0,0,0,0,0,0,0,0,0,0,0,0,0,0,0,0"/>
@@ -1390,7 +1390,7 @@
               </wp:anchor>
             </w:drawing>
           </mc:Choice>
-          <mc:Fallback xmlns:w16sdtfl="http://schemas.microsoft.com/office/word/2024/wordml/sdtformatlock" xmlns:w16du="http://schemas.microsoft.com/office/word/2023/wordml/word16du">
+          <mc:Fallback xmlns:w16du="http://schemas.microsoft.com/office/word/2023/wordml/word16du" xmlns:w16sdtfl="http://schemas.microsoft.com/office/word/2024/wordml/sdtformatlock">
             <w:pict>
               <v:shape w14:anchorId="4BD2B0F0" id="FreeForm 18" o:spid="_x0000_s1026" style="position:absolute;margin-left:26pt;margin-top:7.6pt;width:14.45pt;height:3.05pt;rotation:-90;z-index:251646464;visibility:visible;mso-wrap-style:square;mso-width-percent:0;mso-height-percent:0;mso-wrap-distance-left:9pt;mso-wrap-distance-top:0;mso-wrap-distance-right:9pt;mso-wrap-distance-bottom:0;mso-position-horizontal:absolute;mso-position-horizontal-relative:text;mso-position-vertical:absolute;mso-position-vertical-relative:text;mso-width-percent:0;mso-height-percent:0;mso-width-relative:page;mso-height-relative:page;v-text-anchor:top" coordsize="167,93" o:gfxdata="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" path="m8,19r32,l71,75,87,93,103,75,159,19,167,,151,,103,19r-16,l56,,16,,,19,,37,8,19xe" strokecolor="white" strokeweight="1.5pt">
                 <v:path arrowok="t" o:connecttype="custom" o:connectlocs="9660361,3296224;48302906,3296224;85736670,13010795;105058491,16133336;124379214,13010795;192002843,3296224;201663205,0;182342482,0;124379214,3296224;105058491,3296224;67623629,0;19320723,0;0,3296224;0,6418764;9660361,3296224" o:connectangles="0,0,0,0,0,0,0,0,0,0,0,0,0,0,0"/>
@@ -1616,7 +1616,7 @@
               </wp:anchor>
             </w:drawing>
           </mc:Choice>
-          <mc:Fallback xmlns:w16sdtfl="http://schemas.microsoft.com/office/word/2024/wordml/sdtformatlock" xmlns:w16du="http://schemas.microsoft.com/office/word/2023/wordml/word16du">
+          <mc:Fallback xmlns:w16du="http://schemas.microsoft.com/office/word/2023/wordml/word16du" xmlns:w16sdtfl="http://schemas.microsoft.com/office/word/2024/wordml/sdtformatlock">
             <w:pict>
               <v:shape w14:anchorId="5EC44B68" id="FreeForm 17" o:spid="_x0000_s1026" style="position:absolute;margin-left:444.15pt;margin-top:9.1pt;width:4.1pt;height:14.05pt;rotation:-90;z-index:251655680;visibility:visible;mso-wrap-style:square;mso-width-percent:0;mso-height-percent:0;mso-wrap-distance-left:9pt;mso-wrap-distance-top:0;mso-wrap-distance-right:9pt;mso-wrap-distance-bottom:0;mso-position-horizontal:absolute;mso-position-horizontal-relative:text;mso-position-vertical:absolute;mso-position-vertical-relative:text;mso-width-percent:0;mso-height-percent:0;mso-width-relative:page;mso-height-relative:page;v-text-anchor:top" coordsize="48,427" o:gfxdata="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" path="m16,409l,335,,297,8,260r8,-93l16,56,8,19,16,r8,19l40,112r8,111l40,335,24,427,16,409xe" strokecolor="white" strokeweight="1.5pt">
                 <v:path arrowok="t" o:connecttype="custom" o:connectlocs="18828729,71421221;0,58499100;0,51863574;9413822,45402305;18828729,29162213;18828729,9778823;9413822,3317972;18828729,0;18828729,0;28242551,3317972;47071280,19558064;56485102,38941036;47071280,58499100;28242551,74564518;28242551,74564518;18828729,71421221" o:connectangles="0,0,0,0,0,0,0,0,0,0,0,0,0,0,0,0"/>
@@ -1848,7 +1848,7 @@
               </wp:anchor>
             </w:drawing>
           </mc:Choice>
-          <mc:Fallback xmlns:w16sdtfl="http://schemas.microsoft.com/office/word/2024/wordml/sdtformatlock" xmlns:w16du="http://schemas.microsoft.com/office/word/2023/wordml/word16du">
+          <mc:Fallback xmlns:w16du="http://schemas.microsoft.com/office/word/2023/wordml/word16du" xmlns:w16sdtfl="http://schemas.microsoft.com/office/word/2024/wordml/sdtformatlock">
             <w:pict>
               <v:shape w14:anchorId="2784E679" id="FreeForm 16" o:spid="_x0000_s1026" style="position:absolute;margin-left:388.35pt;margin-top:13.35pt;width:17.95pt;height:6.75pt;rotation:-90;z-index:251652608;visibility:visible;mso-wrap-style:square;mso-width-percent:0;mso-height-percent:0;mso-wrap-distance-left:9pt;mso-wrap-distance-top:0;mso-wrap-distance-right:9pt;mso-wrap-distance-bottom:0;mso-position-horizontal:absolute;mso-position-horizontal-relative:text;mso-position-vertical:absolute;mso-position-vertical-relative:text;mso-width-percent:0;mso-height-percent:0;mso-width-relative:page;mso-height-relative:page;v-text-anchor:top" coordsize="208,204" o:gfxdata="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" path="m16,93l48,37,96,r48,l192,37r16,37l208,93r-8,l184,93r-72,18l72,130,40,186,24,204,8,186,,149,16,93xe" strokecolor="white" strokeweight="1.5pt">
                 <v:path arrowok="t" o:connecttype="custom" o:connectlocs="19219203,16422641;57656513,6533590;115314122,0;172970636,0;230627149,6533590;249846352,13067179;249846352,16422641;240236751,16422641;221017547,16422641;134532230,19600769;86485318,22956231;48046912,32844861;28828805,36023410;9609602,32844861;0,26311272;19219203,16422641" o:connectangles="0,0,0,0,0,0,0,0,0,0,0,0,0,0,0,0"/>
@@ -2074,7 +2074,7 @@
               </wp:anchor>
             </w:drawing>
           </mc:Choice>
-          <mc:Fallback xmlns:w16sdtfl="http://schemas.microsoft.com/office/word/2024/wordml/sdtformatlock" xmlns:w16du="http://schemas.microsoft.com/office/word/2023/wordml/word16du">
+          <mc:Fallback xmlns:w16du="http://schemas.microsoft.com/office/word/2023/wordml/word16du" xmlns:w16sdtfl="http://schemas.microsoft.com/office/word/2024/wordml/sdtformatlock">
             <w:pict>
               <v:shape w14:anchorId="2722CD0D" id="FreeForm 15" o:spid="_x0000_s1026" style="position:absolute;margin-left:13pt;margin-top:8.8pt;width:4.1pt;height:14.65pt;rotation:-90;z-index:251648512;visibility:visible;mso-wrap-style:square;mso-width-percent:0;mso-height-percent:0;mso-wrap-distance-left:9pt;mso-wrap-distance-top:0;mso-wrap-distance-right:9pt;mso-wrap-distance-bottom:0;mso-position-horizontal:absolute;mso-position-horizontal-relative:text;mso-position-vertical:absolute;mso-position-vertical-relative:text;mso-width-percent:0;mso-height-percent:0;mso-width-relative:page;mso-height-relative:page;v-text-anchor:top" coordsize="48,446" o:gfxdata="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" path="m16,19l,111r,38l8,186r8,74l16,390,8,427r8,19l24,427,40,334,48,223,40,111,24,,16,19xe" strokecolor="white" strokeweight="1.5pt">
                 <v:path arrowok="t" o:connecttype="custom" o:connectlocs="18828729,3306439;0,19316764;0,25929643;9413822,32368564;18828729,45246824;18828729,67870027;9413822,74308949;18828729,77615388;18828729,77615388;28242551,74308949;47071280,58124667;56485102,38807903;47071280,19316764;28242551,0;28242551,0;18828729,3306439" o:connectangles="0,0,0,0,0,0,0,0,0,0,0,0,0,0,0,0"/>
@@ -2306,7 +2306,7 @@
               </wp:anchor>
             </w:drawing>
           </mc:Choice>
-          <mc:Fallback xmlns:w16sdtfl="http://schemas.microsoft.com/office/word/2024/wordml/sdtformatlock" xmlns:w16du="http://schemas.microsoft.com/office/word/2023/wordml/word16du">
+          <mc:Fallback xmlns:w16du="http://schemas.microsoft.com/office/word/2023/wordml/word16du" xmlns:w16sdtfl="http://schemas.microsoft.com/office/word/2024/wordml/sdtformatlock">
             <w:pict>
               <v:shape w14:anchorId="27C0B3DC" id="FreeForm 14" o:spid="_x0000_s1026" style="position:absolute;margin-left:54.9pt;margin-top:13.35pt;width:17.95pt;height:6.75pt;rotation:-90;z-index:251645440;visibility:visible;mso-wrap-style:square;mso-width-percent:0;mso-height-percent:0;mso-wrap-distance-left:9pt;mso-wrap-distance-top:0;mso-wrap-distance-right:9pt;mso-wrap-distance-bottom:0;mso-position-horizontal:absolute;mso-position-horizontal-relative:text;mso-position-vertical:absolute;mso-position-vertical-relative:text;mso-width-percent:0;mso-height-percent:0;mso-width-relative:page;mso-height-relative:page;v-text-anchor:top" coordsize="208,204" o:gfxdata="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" path="m16,130r32,56l96,204r48,l192,167r16,-18l208,130r-8,l184,130,112,112,72,74,40,19,24,,8,37,,74r16,56xe" strokecolor="white" strokeweight="1.5pt">
                 <v:path arrowok="t" o:connecttype="custom" o:connectlocs="19219203,22956231;57656513,32844861;115314122,36023410;172970636,36023410;230627149,29489820;249846352,26311272;249846352,22956231;240236751,22956231;221017547,22956231;134532230,19777682;86485318,13067179;48046912,3355041;28828805,0;9609602,6533590;0,13067179;19219203,22956231" o:connectangles="0,0,0,0,0,0,0,0,0,0,0,0,0,0,0,0"/>
@@ -3189,7 +3189,7 @@
               </wp:anchor>
             </w:drawing>
           </mc:Choice>
-          <mc:Fallback xmlns:w16sdtfl="http://schemas.microsoft.com/office/word/2024/wordml/sdtformatlock" xmlns:w16du="http://schemas.microsoft.com/office/word/2023/wordml/word16du">
+          <mc:Fallback xmlns:w16du="http://schemas.microsoft.com/office/word/2023/wordml/word16du" xmlns:w16sdtfl="http://schemas.microsoft.com/office/word/2024/wordml/sdtformatlock">
             <w:pict>
               <v:shape w14:anchorId="1FCF3E9A" id="FreeForm 13" o:spid="_x0000_s1026" style="position:absolute;margin-left:432.55pt;margin-top:7.25pt;width:6.95pt;height:14.1pt;rotation:-90;z-index:251663872;visibility:visible;mso-wrap-style:square;mso-width-percent:0;mso-height-percent:0;mso-wrap-distance-left:9pt;mso-wrap-distance-top:0;mso-wrap-distance-right:9pt;mso-wrap-distance-bottom:0;mso-position-horizontal:absolute;mso-position-horizontal-relative:text;mso-position-vertical:absolute;mso-position-vertical-relative:text;mso-width-percent:0;mso-height-percent:0;mso-width-relative:page;mso-height-relative:page;v-text-anchor:top" coordsize="80,427" o:gfxdata="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" path="m8,l24,,56,55r16,56l80,204r-8,93l40,408,24,427r-8,l16,408r8,-37l32,297r,-56l16,148,,74,8,xe" strokecolor="white" strokeweight="1.5pt">
                 <v:path arrowok="t" o:connecttype="custom" o:connectlocs="9738939,0;29215715,0;68169266,9672716;87646042,19521566;97383878,35877325;87646042,52233083;48692491,71754649;29215715,75096171;19476776,75096171;19476776,71754649;29215715,65247321;38953551,52233083;38953551,42384653;19476776,26028475;0,13014237;9738939,0" o:connectangles="0,0,0,0,0,0,0,0,0,0,0,0,0,0,0,0"/>
@@ -3482,7 +3482,7 @@
               </wp:anchor>
             </w:drawing>
           </mc:Choice>
-          <mc:Fallback xmlns:w16sdtfl="http://schemas.microsoft.com/office/word/2024/wordml/sdtformatlock" xmlns:w16du="http://schemas.microsoft.com/office/word/2023/wordml/word16du">
+          <mc:Fallback xmlns:w16du="http://schemas.microsoft.com/office/word/2023/wordml/word16du" xmlns:w16sdtfl="http://schemas.microsoft.com/office/word/2024/wordml/sdtformatlock">
             <w:pict>
               <v:shape w14:anchorId="701594E3" id="FreeForm 12" o:spid="_x0000_s1026" style="position:absolute;margin-left:395.8pt;margin-top:12.85pt;width:23.35pt;height:20.8pt;rotation:-90;z-index:251656704;visibility:visible;mso-wrap-style:square;mso-width-percent:0;mso-height-percent:0;mso-wrap-distance-left:9pt;mso-wrap-distance-top:0;mso-wrap-distance-right:9pt;mso-wrap-distance-bottom:0;mso-position-horizontal:absolute;mso-position-horizontal-relative:text;mso-position-vertical:absolute;mso-position-vertical-relative:text;mso-width-percent:0;mso-height-percent:0;mso-width-relative:page;mso-height-relative:page;v-text-anchor:top" coordsize="271,631" o:gfxdata="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" path="m120,56l80,37r-32,l48,93,64,204,56,371,40,483,8,594,,631r8,l24,594,56,520,144,334,231,130,255,56,271,18,271,r-8,l223,18,183,37,144,74r-8,l120,56xe" strokecolor="white" strokeweight="1.5pt">
                 <v:path arrowok="t" o:connecttype="custom" o:connectlocs="143688637,9814528;95792789,6484688;57476111,6484688;57476111,16298798;76634450,35752444;67055281,65020200;47895847,84649256;9579169,104102484;0,110587172;9579169,110587172;28737508,104102484;67055281,91133525;172427239,58535930;276602075,22783486;305339584,9814528;324497923,3154430;324497923,0;314918753,0;267021811,3154430;219125964,6484688;172427239,12968958;162848070,12968958;143688637,9814528" o:connectangles="0,0,0,0,0,0,0,0,0,0,0,0,0,0,0,0,0,0,0,0,0,0,0"/>
@@ -3712,7 +3712,7 @@
               </wp:anchor>
             </w:drawing>
           </mc:Choice>
-          <mc:Fallback xmlns:w16sdtfl="http://schemas.microsoft.com/office/word/2024/wordml/sdtformatlock" xmlns:w16du="http://schemas.microsoft.com/office/word/2023/wordml/word16du">
+          <mc:Fallback xmlns:w16du="http://schemas.microsoft.com/office/word/2023/wordml/word16du" xmlns:w16sdtfl="http://schemas.microsoft.com/office/word/2024/wordml/sdtformatlock">
             <w:pict>
               <v:shape w14:anchorId="405E6262" id="FreeForm 11" o:spid="_x0000_s1026" style="position:absolute;margin-left:21.85pt;margin-top:7.25pt;width:6.95pt;height:14.1pt;rotation:-90;z-index:251651584;visibility:visible;mso-wrap-style:square;mso-width-percent:0;mso-height-percent:0;mso-wrap-distance-left:9pt;mso-wrap-distance-top:0;mso-wrap-distance-right:9pt;mso-wrap-distance-bottom:0;mso-position-horizontal:absolute;mso-position-horizontal-relative:text;mso-position-vertical:absolute;mso-position-vertical-relative:text;mso-width-percent:0;mso-height-percent:0;mso-width-relative:page;mso-height-relative:page;v-text-anchor:top" coordsize="80,427" o:gfxdata="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" path="m8,427r16,l56,390,72,315r8,-74l72,148,40,37,24,,16,r,18l24,74r8,56l32,185,16,297,,371r8,56xe" strokecolor="white" strokeweight="1.5pt">
                 <v:path arrowok="t" o:connecttype="custom" o:connectlocs="9738939,75096171;29215715,75096171;68169266,68588842;87646042,55398890;97383878,42384653;87646042,26028475;48692491,6507328;29215715,0;19476776,0;19476776,3165807;29215715,13014237;38953551,22863087;38953551,32535803;19476776,52233083;0,65247321;9738939,75096171" o:connectangles="0,0,0,0,0,0,0,0,0,0,0,0,0,0,0,0"/>
@@ -3942,7 +3942,7 @@
               </wp:anchor>
             </w:drawing>
           </mc:Choice>
-          <mc:Fallback xmlns:w16sdtfl="http://schemas.microsoft.com/office/word/2024/wordml/sdtformatlock" xmlns:w16du="http://schemas.microsoft.com/office/word/2023/wordml/word16du">
+          <mc:Fallback xmlns:w16du="http://schemas.microsoft.com/office/word/2023/wordml/word16du" xmlns:w16sdtfl="http://schemas.microsoft.com/office/word/2024/wordml/sdtformatlock">
             <w:pict>
               <v:shape w14:anchorId="41CF14AA" id="FreeForm 10" o:spid="_x0000_s1026" style="position:absolute;margin-left:412.8pt;margin-top:6.55pt;width:19.9pt;height:6.1pt;rotation:-90;z-index:251662848;visibility:visible;mso-wrap-style:square;mso-width-percent:0;mso-height-percent:0;mso-wrap-distance-left:9pt;mso-wrap-distance-top:0;mso-wrap-distance-right:9pt;mso-wrap-distance-bottom:0;mso-position-horizontal:absolute;mso-position-horizontal-relative:text;mso-position-vertical:absolute;mso-position-vertical-relative:text;mso-width-percent:0;mso-height-percent:0;mso-width-relative:page;mso-height-relative:page;v-text-anchor:top" coordsize="231,186" o:gfxdata="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" path="m,167l48,93,112,19,175,r24,l223,37r8,37l223,111r-8,19l207,111,160,74,104,93,48,130,8,186r-8,l,167xe" strokecolor="white" strokeweight="1.5pt">
                 <v:path arrowok="t" o:connecttype="custom" o:connectlocs="0,28970448;57455047,16133336;134062871,3296224;209472689,0;238200760,0;266927737,6418764;276504125,12837112;266927737,19255877;257352443,22552100;247776054,19255877;191517919,12837112;124486483,16133336;57455047,22552100;9576388,32266672;0,32266672;0,28970448" o:connectangles="0,0,0,0,0,0,0,0,0,0,0,0,0,0,0,0"/>
@@ -4174,7 +4174,7 @@
               </wp:anchor>
             </w:drawing>
           </mc:Choice>
-          <mc:Fallback xmlns:w16sdtfl="http://schemas.microsoft.com/office/word/2024/wordml/sdtformatlock" xmlns:w16du="http://schemas.microsoft.com/office/word/2023/wordml/word16du">
+          <mc:Fallback xmlns:w16du="http://schemas.microsoft.com/office/word/2023/wordml/word16du" xmlns:w16sdtfl="http://schemas.microsoft.com/office/word/2024/wordml/sdtformatlock">
             <w:pict>
               <v:shape w14:anchorId="2DDF7FF9" id="FreeForm 9" o:spid="_x0000_s1026" style="position:absolute;margin-left:444.6pt;margin-top:8.55pt;width:3.45pt;height:14.05pt;rotation:-90;z-index:251661824;visibility:visible;mso-wrap-style:square;mso-width-percent:0;mso-height-percent:0;mso-wrap-distance-left:9pt;mso-wrap-distance-top:0;mso-wrap-distance-right:9pt;mso-wrap-distance-bottom:0;mso-position-horizontal:absolute;mso-position-horizontal-relative:text;mso-position-vertical:absolute;mso-position-vertical-relative:text;mso-width-percent:0;mso-height-percent:0;mso-width-relative:page;mso-height-relative:page;v-text-anchor:top" coordsize="40,427" o:gfxdata="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" path="m24,409l40,335r,-38l32,260,24,167,32,56r,-37l32,,24,,16,19,,112,,223,,335r16,92l24,427r,-18xe" strokecolor="white" strokeweight="1.5pt">
                 <v:path arrowok="t" o:connecttype="custom" o:connectlocs="28796313,71421221;47993856,58499100;47993856,51863574;38395085,45402305;28796313,29162213;38395085,9778823;38395085,3317972;38395085,0;28796313,0;19197542,3317972;0,19558064;0,38941036;0,58499100;19197542,74564518;28796313,74564518;28796313,71421221" o:connectangles="0,0,0,0,0,0,0,0,0,0,0,0,0,0,0,0"/>
@@ -4442,7 +4442,7 @@
               </wp:anchor>
             </w:drawing>
           </mc:Choice>
-          <mc:Fallback xmlns:w16sdtfl="http://schemas.microsoft.com/office/word/2024/wordml/sdtformatlock" xmlns:w16du="http://schemas.microsoft.com/office/word/2023/wordml/word16du">
+          <mc:Fallback xmlns:w16du="http://schemas.microsoft.com/office/word/2023/wordml/word16du" xmlns:w16sdtfl="http://schemas.microsoft.com/office/word/2024/wordml/sdtformatlock">
             <w:pict>
               <v:shape w14:anchorId="332B4940" id="FreeForm 8" o:spid="_x0000_s1026" style="position:absolute;margin-left:428.6pt;margin-top:16.75pt;width:22pt;height:20.2pt;rotation:-90;z-index:251660800;visibility:visible;mso-wrap-style:square;mso-width-percent:0;mso-height-percent:0;mso-wrap-distance-left:9pt;mso-wrap-distance-top:0;mso-wrap-distance-right:9pt;mso-wrap-distance-bottom:0;mso-position-horizontal:absolute;mso-position-horizontal-relative:text;mso-position-vertical:absolute;mso-position-vertical-relative:text;mso-width-percent:0;mso-height-percent:0;mso-width-relative:page;mso-height-relative:page;v-text-anchor:top" coordsize="255,613" o:gfxdata="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" path="m255,19r-8,37l215,130,135,316,48,502,16,576,,613,,594,,557,16,390r,-74l8,260r,-18l16,242,64,223r63,-56l191,93,231,19,255,r,19xe" strokecolor="white" strokeweight="1.5pt">
                 <v:path arrowok="t" o:connecttype="custom" o:connectlocs="306134745,3327487;296531055,9807947;258114103,22768448;162071722,55344843;57625428,87921238;19208476,100881739;0,107361781;0,104034294;0,97553834;19208476,68305344;19208476,55344843;9603690,45536896;9603690,42384342;19208476,42384342;76833904,39056436;152466936,29248489;229300841,16287988;277322579,3327487;306134745,0;306134745,3327487" o:connectangles="0,0,0,0,0,0,0,0,0,0,0,0,0,0,0,0,0,0,0,0"/>
@@ -4662,7 +4662,7 @@
               </wp:anchor>
             </w:drawing>
           </mc:Choice>
-          <mc:Fallback xmlns:w16sdtfl="http://schemas.microsoft.com/office/word/2024/wordml/sdtformatlock" xmlns:w16du="http://schemas.microsoft.com/office/word/2023/wordml/word16du">
+          <mc:Fallback xmlns:w16du="http://schemas.microsoft.com/office/word/2023/wordml/word16du" xmlns:w16sdtfl="http://schemas.microsoft.com/office/word/2024/wordml/sdtformatlock">
             <w:pict>
               <v:shape w14:anchorId="2BF9838A" id="FreeForm 7" o:spid="_x0000_s1026" style="position:absolute;margin-left:421.4pt;margin-top:29.8pt;width:14.35pt;height:3.05pt;rotation:-90;z-index:251659776;visibility:visible;mso-wrap-style:square;mso-width-percent:0;mso-height-percent:0;mso-wrap-distance-left:9pt;mso-wrap-distance-top:0;mso-wrap-distance-right:9pt;mso-wrap-distance-bottom:0;mso-position-horizontal:absolute;mso-position-horizontal-relative:text;mso-position-vertical:absolute;mso-position-vertical-relative:text;mso-width-percent:0;mso-height-percent:0;mso-width-relative:page;mso-height-relative:page;v-text-anchor:top" coordsize="167,93" o:gfxdata="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" path="m151,56r-32,l88,18,72,,56,,,74,8,93,64,56r16,l111,93,151,74r8,-18l167,56r-16,xe" strokecolor="white" strokeweight="1.5pt">
                 <v:path arrowok="t" o:connecttype="custom" o:connectlocs="179826707,9714571;141717859,9714571;104799605,3122541;85745727,0;66690757,0;0,12837112;0,12837112;9526939,16133336;76217696,9714571;95272666,9714571;132190920,16133336;179826707,12837112;189354738,9714571;198881677,9714571;179826707,9714571" o:connectangles="0,0,0,0,0,0,0,0,0,0,0,0,0,0,0"/>
@@ -4894,7 +4894,7 @@
               </wp:anchor>
             </w:drawing>
           </mc:Choice>
-          <mc:Fallback xmlns:w16sdtfl="http://schemas.microsoft.com/office/word/2024/wordml/sdtformatlock" xmlns:w16du="http://schemas.microsoft.com/office/word/2023/wordml/word16du">
+          <mc:Fallback xmlns:w16du="http://schemas.microsoft.com/office/word/2023/wordml/word16du" xmlns:w16sdtfl="http://schemas.microsoft.com/office/word/2024/wordml/sdtformatlock">
             <w:pict>
               <v:shape w14:anchorId="40CEFC85" id="FreeForm 6" o:spid="_x0000_s1026" style="position:absolute;margin-left:388.4pt;margin-top:11.85pt;width:17.95pt;height:6.75pt;rotation:-90;z-index:251658752;visibility:visible;mso-wrap-style:square;mso-width-percent:0;mso-height-percent:0;mso-wrap-distance-left:9pt;mso-wrap-distance-top:0;mso-wrap-distance-right:9pt;mso-wrap-distance-bottom:0;mso-position-horizontal:absolute;mso-position-horizontal-relative:text;mso-position-vertical:absolute;mso-position-vertical-relative:text;mso-width-percent:0;mso-height-percent:0;mso-width-relative:page;mso-height-relative:page;v-text-anchor:top" coordsize="208,204" o:gfxdata="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" path="m200,93l160,37,112,,64,,16,37,,74,,93r8,l32,93r72,18l136,130r32,56l184,204r16,-18l208,149,200,93xe" strokecolor="white" strokeweight="1.5pt">
                 <v:path arrowok="t" o:connecttype="custom" o:connectlocs="240236751,16422641;192189839,6533590;134532230,0;76875716,0;19219203,6533590;0,13067179;0,16422641;9609602,16422641;38438406,16422641;124923724,19600769;163361034,22956231;201799440,32844861;221017547,36023410;240236751,32844861;249846352,26311272;240236751,16422641" o:connectangles="0,0,0,0,0,0,0,0,0,0,0,0,0,0,0,0"/>
@@ -5117,7 +5117,7 @@
               </wp:anchor>
             </w:drawing>
           </mc:Choice>
-          <mc:Fallback xmlns:w16sdtfl="http://schemas.microsoft.com/office/word/2024/wordml/sdtformatlock" xmlns:w16du="http://schemas.microsoft.com/office/word/2023/wordml/word16du">
+          <mc:Fallback xmlns:w16du="http://schemas.microsoft.com/office/word/2023/wordml/word16du" xmlns:w16sdtfl="http://schemas.microsoft.com/office/word/2024/wordml/sdtformatlock">
             <w:pict>
               <v:shape w14:anchorId="0498CD70" id="FreeForm 5" o:spid="_x0000_s1026" style="position:absolute;margin-left:409.3pt;margin-top:2.1pt;width:6.2pt;height:15.9pt;rotation:-90;z-index:251657728;visibility:visible;mso-wrap-style:square;mso-width-percent:0;mso-height-percent:0;mso-wrap-distance-left:9pt;mso-wrap-distance-top:0;mso-wrap-distance-right:9pt;mso-wrap-distance-bottom:0;mso-position-horizontal:absolute;mso-position-horizontal-relative:text;mso-position-vertical:absolute;mso-position-vertical-relative:text;mso-width-percent:0;mso-height-percent:0;mso-width-relative:page;mso-height-relative:page;v-text-anchor:top" coordsize="72,483" o:gfxdata="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" path="m16,483l56,353,72,223,72,93,48,,32,,8,18,,55,,93r24,92l40,297r-8,93l8,464r,19l16,483xe" strokecolor="white" strokeweight="1.5pt">
                 <v:path arrowok="t" o:connecttype="custom" o:connectlocs="19136007,84421791;66974932,61699440;86110939,38977507;86110939,16255156;57406928,0;38272014,0;9568004,3146011;0,9613206;0,16255156;28704011,32335557;47838924,51911479;38272014,68166635;9568004,81101025;9568004,84421791;19136007,84421791" o:connectangles="0,0,0,0,0,0,0,0,0,0,0,0,0,0,0"/>
@@ -5349,7 +5349,7 @@
               </wp:anchor>
             </w:drawing>
           </mc:Choice>
-          <mc:Fallback xmlns:w16sdtfl="http://schemas.microsoft.com/office/word/2024/wordml/sdtformatlock" xmlns:w16du="http://schemas.microsoft.com/office/word/2023/wordml/word16du">
+          <mc:Fallback xmlns:w16du="http://schemas.microsoft.com/office/word/2023/wordml/word16du" xmlns:w16sdtfl="http://schemas.microsoft.com/office/word/2024/wordml/sdtformatlock">
             <w:pict>
               <v:shape w14:anchorId="4C649850" id="FreeForm 4" o:spid="_x0000_s1026" style="position:absolute;margin-left:13.45pt;margin-top:8.25pt;width:3.45pt;height:14.65pt;rotation:-90;z-index:251650560;visibility:visible;mso-wrap-style:square;mso-width-percent:0;mso-height-percent:0;mso-wrap-distance-left:9pt;mso-wrap-distance-top:0;mso-wrap-distance-right:9pt;mso-wrap-distance-bottom:0;mso-position-horizontal:absolute;mso-position-horizontal-relative:text;mso-position-vertical:absolute;mso-position-vertical-relative:text;mso-width-percent:0;mso-height-percent:0;mso-width-relative:page;mso-height-relative:page;v-text-anchor:top" coordsize="40,446" o:gfxdata="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" path="m24,19r16,92l40,149r-8,37l24,260r8,130l32,427r,19l24,446,16,427,,334,,223,,111,16,r8,l24,19xe" strokecolor="white" strokeweight="1.5pt">
                 <v:path arrowok="t" o:connecttype="custom" o:connectlocs="28796313,3306439;47993856,19316764;47993856,25929643;38395085,32368564;28796313,45246824;38395085,67870027;38395085,74308949;38395085,77615388;28796313,77615388;19197542,74308949;0,58124667;0,38807903;0,19316764;19197542,0;28796313,0;28796313,3306439" o:connectangles="0,0,0,0,0,0,0,0,0,0,0,0,0,0,0,0"/>
@@ -5572,7 +5572,7 @@
               </wp:anchor>
             </w:drawing>
           </mc:Choice>
-          <mc:Fallback xmlns:w16sdtfl="http://schemas.microsoft.com/office/word/2024/wordml/sdtformatlock" xmlns:w16du="http://schemas.microsoft.com/office/word/2023/wordml/word16du">
+          <mc:Fallback xmlns:w16du="http://schemas.microsoft.com/office/word/2023/wordml/word16du" xmlns:w16sdtfl="http://schemas.microsoft.com/office/word/2024/wordml/sdtformatlock">
             <w:pict>
               <v:shape w14:anchorId="238A198E" id="FreeForm 3" o:spid="_x0000_s1026" style="position:absolute;margin-left:26.05pt;margin-top:29.8pt;width:14.35pt;height:3.05pt;rotation:-90;z-index:251649536;visibility:visible;mso-wrap-style:square;mso-width-percent:0;mso-height-percent:0;mso-wrap-distance-left:9pt;mso-wrap-distance-top:0;mso-wrap-distance-right:9pt;mso-wrap-distance-bottom:0;mso-position-horizontal:absolute;mso-position-horizontal-relative:text;mso-position-vertical:absolute;mso-position-vertical-relative:text;mso-width-percent:0;mso-height-percent:0;mso-width-relative:page;mso-height-relative:page;v-text-anchor:top" coordsize="167,93" o:gfxdata="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" path="m151,19r-32,l88,75,72,93,56,75,,19,,,8,,64,19r16,l111,r40,l159,19r8,18l151,19xe" strokecolor="white" strokeweight="1.5pt">
                 <v:path arrowok="t" o:connecttype="custom" o:connectlocs="179826707,3296224;141717859,3296224;104799605,13010795;85745727,16133336;66690757,13010795;0,3296224;0,0;9526939,0;76217696,3296224;95272666,3296224;132190920,0;179826707,0;189354738,3296224;198881677,6418764;179826707,3296224" o:connectangles="0,0,0,0,0,0,0,0,0,0,0,0,0,0,0"/>
@@ -5599,26 +5599,13 @@
         </w:rPr>
         <w:t xml:space="preserve"> – 2026</w:t>
       </w:r>
-    </w:p>
-    <w:p>
-      <w:pPr>
-        <w:spacing w:before="0" w:after="0" w:line="240" w:lineRule="auto"/>
-        <w:jc w:val="left"/>
+      <w:r>
         <w:rPr>
           <w:b/>
           <w:iCs/>
           <w:sz w:val="36"/>
           <w:szCs w:val="36"/>
         </w:rPr>
-      </w:pPr>
-      <w:r>
-        <w:rPr>
-          <w:b/>
-          <w:iCs/>
-          <w:sz w:val="36"/>
-          <w:szCs w:val="36"/>
-        </w:rPr>
-        <w:lastRenderedPageBreak/>
         <w:br w:type="page"/>
       </w:r>
     </w:p>
@@ -5638,7 +5625,10 @@
     <w:sdt>
       <w:sdtPr>
         <w:rPr>
-          <w:rFonts w:eastAsia="SimSun"/>
+          <w:rFonts w:ascii="Times New Roman" w:eastAsia="SimSun" w:hAnsi="Times New Roman" w:cs="Times New Roman"/>
+          <w:color w:val="auto"/>
+          <w:sz w:val="28"/>
+          <w:szCs w:val="24"/>
         </w:rPr>
         <w:id w:val="1092441269"/>
         <w:docPartObj>
@@ -5648,13 +5638,9 @@
       </w:sdtPr>
       <w:sdtEndPr>
         <w:rPr>
-          <w:rFonts w:ascii="Times New Roman" w:hAnsi="Times New Roman" w:cs="Times New Roman"/>
           <w:b/>
           <w:bCs/>
           <w:noProof/>
-          <w:color w:val="auto"/>
-          <w:sz w:val="28"/>
-          <w:szCs w:val="24"/>
         </w:rPr>
       </w:sdtEndPr>
       <w:sdtContent>
@@ -5805,7 +5791,7 @@
                 <w:noProof/>
                 <w:webHidden/>
               </w:rPr>
-              <w:t>4</w:t>
+              <w:t>3</w:t>
             </w:r>
             <w:r>
               <w:rPr>
@@ -5877,7 +5863,7 @@
                 <w:noProof/>
                 <w:webHidden/>
               </w:rPr>
-              <w:t>7</w:t>
+              <w:t>6</w:t>
             </w:r>
             <w:r>
               <w:rPr>
@@ -5967,7 +5953,7 @@
                 <w:noProof/>
                 <w:webHidden/>
               </w:rPr>
-              <w:t>7</w:t>
+              <w:t>6</w:t>
             </w:r>
             <w:r>
               <w:rPr>
@@ -6057,7 +6043,7 @@
                 <w:noProof/>
                 <w:webHidden/>
               </w:rPr>
-              <w:t>8</w:t>
+              <w:t>7</w:t>
             </w:r>
             <w:r>
               <w:rPr>
@@ -6147,7 +6133,7 @@
                 <w:noProof/>
                 <w:webHidden/>
               </w:rPr>
-              <w:t>9</w:t>
+              <w:t>8</w:t>
             </w:r>
             <w:r>
               <w:rPr>
@@ -6237,7 +6223,7 @@
                 <w:noProof/>
                 <w:webHidden/>
               </w:rPr>
-              <w:t>10</w:t>
+              <w:t>9</w:t>
             </w:r>
             <w:r>
               <w:rPr>
@@ -6309,7 +6295,7 @@
                 <w:noProof/>
                 <w:webHidden/>
               </w:rPr>
-              <w:t>13</w:t>
+              <w:t>12</w:t>
             </w:r>
             <w:r>
               <w:rPr>
@@ -6381,7 +6367,7 @@
                 <w:noProof/>
                 <w:webHidden/>
               </w:rPr>
-              <w:t>14</w:t>
+              <w:t>13</w:t>
             </w:r>
             <w:r>
               <w:rPr>
@@ -6453,7 +6439,7 @@
                 <w:noProof/>
                 <w:webHidden/>
               </w:rPr>
-              <w:t>15</w:t>
+              <w:t>14</w:t>
             </w:r>
             <w:r>
               <w:rPr>
@@ -6525,7 +6511,7 @@
                 <w:noProof/>
                 <w:webHidden/>
               </w:rPr>
-              <w:t>15</w:t>
+              <w:t>14</w:t>
             </w:r>
             <w:r>
               <w:rPr>
@@ -6597,7 +6583,7 @@
                 <w:noProof/>
                 <w:webHidden/>
               </w:rPr>
-              <w:t>22</w:t>
+              <w:t>21</w:t>
             </w:r>
             <w:r>
               <w:rPr>
@@ -6669,7 +6655,7 @@
                 <w:noProof/>
                 <w:webHidden/>
               </w:rPr>
-              <w:t>23</w:t>
+              <w:t>22</w:t>
             </w:r>
             <w:r>
               <w:rPr>
@@ -6741,7 +6727,7 @@
                 <w:noProof/>
                 <w:webHidden/>
               </w:rPr>
-              <w:t>27</w:t>
+              <w:t>26</w:t>
             </w:r>
             <w:r>
               <w:rPr>
@@ -6813,7 +6799,7 @@
                 <w:noProof/>
                 <w:webHidden/>
               </w:rPr>
-              <w:t>27</w:t>
+              <w:t>26</w:t>
             </w:r>
             <w:r>
               <w:rPr>
@@ -6885,7 +6871,7 @@
                 <w:noProof/>
                 <w:webHidden/>
               </w:rPr>
-              <w:t>35</w:t>
+              <w:t>34</w:t>
             </w:r>
             <w:r>
               <w:rPr>
@@ -6957,7 +6943,7 @@
                 <w:noProof/>
                 <w:webHidden/>
               </w:rPr>
-              <w:t>44</w:t>
+              <w:t>43</w:t>
             </w:r>
             <w:r>
               <w:rPr>
@@ -7029,7 +7015,7 @@
                 <w:noProof/>
                 <w:webHidden/>
               </w:rPr>
-              <w:t>44</w:t>
+              <w:t>43</w:t>
             </w:r>
             <w:r>
               <w:rPr>
@@ -7101,7 +7087,7 @@
                 <w:noProof/>
                 <w:webHidden/>
               </w:rPr>
-              <w:t>45</w:t>
+              <w:t>44</w:t>
             </w:r>
             <w:r>
               <w:rPr>
@@ -7173,7 +7159,7 @@
                 <w:noProof/>
                 <w:webHidden/>
               </w:rPr>
-              <w:t>48</w:t>
+              <w:t>47</w:t>
             </w:r>
             <w:r>
               <w:rPr>
@@ -7245,7 +7231,7 @@
                 <w:noProof/>
                 <w:webHidden/>
               </w:rPr>
-              <w:t>50</w:t>
+              <w:t>49</w:t>
             </w:r>
             <w:r>
               <w:rPr>
@@ -7317,7 +7303,7 @@
                 <w:noProof/>
                 <w:webHidden/>
               </w:rPr>
-              <w:t>55</w:t>
+              <w:t>54</w:t>
             </w:r>
             <w:r>
               <w:rPr>
@@ -7389,7 +7375,7 @@
                 <w:noProof/>
                 <w:webHidden/>
               </w:rPr>
-              <w:t>55</w:t>
+              <w:t>54</w:t>
             </w:r>
             <w:r>
               <w:rPr>
@@ -7461,7 +7447,7 @@
                 <w:noProof/>
                 <w:webHidden/>
               </w:rPr>
-              <w:t>56</w:t>
+              <w:t>55</w:t>
             </w:r>
             <w:r>
               <w:rPr>
@@ -7533,7 +7519,7 @@
                 <w:noProof/>
                 <w:webHidden/>
               </w:rPr>
-              <w:t>58</w:t>
+              <w:t>57</w:t>
             </w:r>
             <w:r>
               <w:rPr>
@@ -7605,7 +7591,7 @@
                 <w:noProof/>
                 <w:webHidden/>
               </w:rPr>
-              <w:t>60</w:t>
+              <w:t>59</w:t>
             </w:r>
             <w:r>
               <w:rPr>
@@ -7677,7 +7663,7 @@
                 <w:noProof/>
                 <w:webHidden/>
               </w:rPr>
-              <w:t>61</w:t>
+              <w:t>60</w:t>
             </w:r>
             <w:r>
               <w:rPr>
@@ -7749,7 +7735,7 @@
                 <w:noProof/>
                 <w:webHidden/>
               </w:rPr>
-              <w:t>61</w:t>
+              <w:t>60</w:t>
             </w:r>
             <w:r>
               <w:rPr>
@@ -7821,7 +7807,7 @@
                 <w:noProof/>
                 <w:webHidden/>
               </w:rPr>
-              <w:t>64</w:t>
+              <w:t>63</w:t>
             </w:r>
             <w:r>
               <w:rPr>
@@ -8524,40 +8510,16 @@
         <w:pStyle w:val="Caption"/>
       </w:pPr>
       <w:r>
-        <w:t xml:space="preserve">Hình </w:t>
-      </w:r>
-      <w:r>
-        <w:fldChar w:fldCharType="begin"/>
-      </w:r>
-      <w:r>
-        <w:instrText xml:space="preserve"> STYLEREF 4 \s </w:instrText>
-      </w:r>
-      <w:r>
-        <w:fldChar w:fldCharType="separate"/>
-      </w:r>
-      <w:r>
-        <w:fldChar w:fldCharType="end"/>
-      </w:r>
-      <w:r>
-        <w:fldChar w:fldCharType="begin"/>
-      </w:r>
-      <w:r>
-        <w:instrText xml:space="preserve"> SEQ Hình \* ARABIC \s 4 </w:instrText>
-      </w:r>
-      <w:r>
-        <w:fldChar w:fldCharType="separate"/>
-      </w:r>
-      <w:r>
-        <w:rPr>
-          <w:noProof/>
-        </w:rPr>
+        <w:t>Hình</w:t>
+      </w:r>
+      <w:r>
+        <w:t xml:space="preserve"> </w:t>
+      </w:r>
+      <w:r>
         <w:t>1</w:t>
       </w:r>
       <w:r>
-        <w:fldChar w:fldCharType="end"/>
-      </w:r>
-      <w:r>
-        <w:t xml:space="preserve"> .1  Phân bố biến mục tiêu TARGET trong bảng applications</w:t>
+        <w:t>.1  Phân bố biến mục tiêu TARGET trong bảng applications</w:t>
       </w:r>
     </w:p>
     <w:p>
@@ -8642,7 +8604,10 @@
         <w:t>2</w:t>
       </w:r>
       <w:r>
-        <w:t>. Sơ đồ quan hệ các bảng trong bộ dữ liệu Home Credit Default Risk</w:t>
+        <w:t xml:space="preserve"> </w:t>
+      </w:r>
+      <w:r>
+        <w:t xml:space="preserve"> Sơ đồ quan hệ các bảng trong bộ dữ liệu Home Credit Default Risk</w:t>
       </w:r>
     </w:p>
     <w:p>
@@ -10338,16 +10303,22 @@
         <w:t>Hình</w:t>
       </w:r>
       <w:r>
-        <w:t xml:space="preserve"> 1</w:t>
+        <w:t xml:space="preserve"> </w:t>
+      </w:r>
+      <w:r>
+        <w:t>2</w:t>
       </w:r>
       <w:r>
         <w:t>.</w:t>
       </w:r>
       <w:r>
-        <w:t>3</w:t>
-      </w:r>
-      <w:r>
-        <w:t>. Kết quả kiểm tra grain của các bảng summary</w:t>
+        <w:t>1</w:t>
+      </w:r>
+      <w:r>
+        <w:t xml:space="preserve"> </w:t>
+      </w:r>
+      <w:r>
+        <w:t xml:space="preserve"> Kết quả kiểm tra grain của các bảng summary</w:t>
       </w:r>
     </w:p>
     <w:p>
@@ -10501,15 +10472,16 @@
     <w:tbl>
       <w:tblPr>
         <w:tblStyle w:val="TableGrid"/>
-        <w:tblW w:w="0" w:type="auto"/>
+        <w:tblW w:w="10183" w:type="dxa"/>
         <w:tblLook w:val="04A0" w:firstRow="1" w:lastRow="0" w:firstColumn="1" w:lastColumn="0" w:noHBand="0" w:noVBand="1"/>
       </w:tblPr>
       <w:tblGrid>
-        <w:gridCol w:w="1787"/>
-        <w:gridCol w:w="2487"/>
+        <w:gridCol w:w="4258"/>
+        <w:gridCol w:w="5925"/>
       </w:tblGrid>
       <w:tr>
         <w:trPr>
+          <w:trHeight w:val="714"/>
           <w:tblHeader/>
         </w:trPr>
         <w:tc>
@@ -10557,6 +10529,7 @@
       </w:tr>
       <w:tr>
         <w:trPr>
+          <w:trHeight w:val="714"/>
           <w:tblHeader/>
         </w:trPr>
         <w:tc>
@@ -10584,6 +10557,7 @@
       </w:tr>
       <w:tr>
         <w:trPr>
+          <w:trHeight w:val="714"/>
           <w:tblHeader/>
         </w:trPr>
         <w:tc>
@@ -10611,6 +10585,7 @@
       </w:tr>
       <w:tr>
         <w:trPr>
+          <w:trHeight w:val="714"/>
           <w:tblHeader/>
         </w:trPr>
         <w:tc>
@@ -10638,6 +10613,7 @@
       </w:tr>
       <w:tr>
         <w:trPr>
+          <w:trHeight w:val="714"/>
           <w:tblHeader/>
         </w:trPr>
         <w:tc>
@@ -10665,6 +10641,7 @@
       </w:tr>
       <w:tr>
         <w:trPr>
+          <w:trHeight w:val="714"/>
           <w:tblHeader/>
         </w:trPr>
         <w:tc>
@@ -10784,17 +10761,18 @@
     <w:tbl>
       <w:tblPr>
         <w:tblStyle w:val="TableGrid"/>
-        <w:tblW w:w="0" w:type="auto"/>
+        <w:tblW w:w="9862" w:type="dxa"/>
         <w:tblLook w:val="04A0" w:firstRow="1" w:lastRow="0" w:firstColumn="1" w:lastColumn="0" w:noHBand="0" w:noVBand="1"/>
       </w:tblPr>
       <w:tblGrid>
-        <w:gridCol w:w="3413"/>
-        <w:gridCol w:w="1375"/>
-        <w:gridCol w:w="1139"/>
-        <w:gridCol w:w="1173"/>
+        <w:gridCol w:w="4741"/>
+        <w:gridCol w:w="1910"/>
+        <w:gridCol w:w="1582"/>
+        <w:gridCol w:w="1629"/>
       </w:tblGrid>
       <w:tr>
         <w:trPr>
+          <w:trHeight w:val="763"/>
           <w:tblHeader/>
         </w:trPr>
         <w:tc>
@@ -10884,6 +10862,7 @@
       </w:tr>
       <w:tr>
         <w:trPr>
+          <w:trHeight w:val="763"/>
           <w:tblHeader/>
         </w:trPr>
         <w:tc>
@@ -10933,6 +10912,7 @@
       </w:tr>
       <w:tr>
         <w:trPr>
+          <w:trHeight w:val="763"/>
           <w:tblHeader/>
         </w:trPr>
         <w:tc>
@@ -10982,6 +10962,7 @@
       </w:tr>
       <w:tr>
         <w:trPr>
+          <w:trHeight w:val="763"/>
           <w:tblHeader/>
         </w:trPr>
         <w:tc>
@@ -13336,6 +13317,9 @@
         </w:rPr>
       </w:pPr>
       <w:r>
+        <w:rPr>
+          <w:noProof/>
+        </w:rPr>
         <w:lastRenderedPageBreak/>
         <w:drawing>
           <wp:inline distT="0" distB="0" distL="0" distR="0" wp14:anchorId="65136E38" wp14:editId="67BAAE0C">
@@ -13379,6 +13363,39 @@
         </w:rPr>
         <w:t xml:space="preserve"> </w:t>
       </w:r>
+    </w:p>
+    <w:p>
+      <w:pPr>
+        <w:pStyle w:val="Caption"/>
+        <w:rPr>
+          <w:noProof/>
+        </w:rPr>
+      </w:pPr>
+      <w:r>
+        <w:rPr>
+          <w:noProof/>
+        </w:rPr>
+        <w:t>Hình 3.</w:t>
+      </w:r>
+      <w:r>
+        <w:rPr>
+          <w:noProof/>
+        </w:rPr>
+        <w:t xml:space="preserve">1 </w:t>
+      </w:r>
+      <w:r>
+        <w:rPr>
+          <w:noProof/>
+        </w:rPr>
+        <w:t xml:space="preserve"> Biểu đồ phân phối độ tuổi khách hàng và Tỷ lệ nợ theo nhóm tuổi</w:t>
+      </w:r>
+    </w:p>
+    <w:p>
+      <w:pPr>
+        <w:rPr>
+          <w:noProof/>
+        </w:rPr>
+      </w:pPr>
       <w:r>
         <w:rPr>
           <w:noProof/>
@@ -13422,6 +13439,32 @@
     </w:p>
     <w:p>
       <w:pPr>
+        <w:pStyle w:val="Caption"/>
+        <w:rPr>
+          <w:noProof/>
+        </w:rPr>
+      </w:pPr>
+      <w:r>
+        <w:rPr>
+          <w:noProof/>
+        </w:rPr>
+        <w:t>Hình 3.2</w:t>
+      </w:r>
+      <w:r>
+        <w:rPr>
+          <w:noProof/>
+        </w:rPr>
+        <w:t xml:space="preserve"> </w:t>
+      </w:r>
+      <w:r>
+        <w:rPr>
+          <w:noProof/>
+        </w:rPr>
+        <w:t xml:space="preserve"> Biểu đồ Điểm đánh giá ngoài</w:t>
+      </w:r>
+    </w:p>
+    <w:p>
+      <w:pPr>
         <w:pStyle w:val="Heading3"/>
       </w:pPr>
       <w:r>
@@ -13707,6 +13750,9 @@
     </w:p>
     <w:p>
       <w:r>
+        <w:rPr>
+          <w:noProof/>
+        </w:rPr>
         <w:lastRenderedPageBreak/>
         <w:drawing>
           <wp:inline distT="0" distB="0" distL="0" distR="0" wp14:anchorId="144A5D3E" wp14:editId="2C158814">
@@ -13747,6 +13793,20 @@
     </w:p>
     <w:p>
       <w:pPr>
+        <w:pStyle w:val="Caption"/>
+      </w:pPr>
+      <w:r>
+        <w:t>Hình 3.3</w:t>
+      </w:r>
+      <w:r>
+        <w:t xml:space="preserve"> </w:t>
+      </w:r>
+      <w:r>
+        <w:t xml:space="preserve"> Biểu đồ headmap Tỷ lệ vỡ nợ theo điểm đánh giá ngoài và LTV</w:t>
+      </w:r>
+    </w:p>
+    <w:p>
+      <w:pPr>
         <w:pStyle w:val="Heading3"/>
       </w:pPr>
       <w:r>
@@ -17328,19 +17388,20 @@
     <w:tbl>
       <w:tblPr>
         <w:tblStyle w:val="TableGrid"/>
-        <w:tblW w:w="0" w:type="auto"/>
+        <w:tblW w:w="10118" w:type="dxa"/>
         <w:tblLook w:val="04A0" w:firstRow="1" w:lastRow="0" w:firstColumn="1" w:lastColumn="0" w:noHBand="0" w:noVBand="1"/>
       </w:tblPr>
       <w:tblGrid>
-        <w:gridCol w:w="2674"/>
-        <w:gridCol w:w="1539"/>
-        <w:gridCol w:w="1290"/>
-        <w:gridCol w:w="1321"/>
-        <w:gridCol w:w="986"/>
-        <w:gridCol w:w="1243"/>
+        <w:gridCol w:w="2989"/>
+        <w:gridCol w:w="1720"/>
+        <w:gridCol w:w="1442"/>
+        <w:gridCol w:w="1476"/>
+        <w:gridCol w:w="1102"/>
+        <w:gridCol w:w="1389"/>
       </w:tblGrid>
       <w:tr>
         <w:trPr>
+          <w:trHeight w:val="963"/>
           <w:tblHeader/>
         </w:trPr>
         <w:tc>
@@ -17473,6 +17534,7 @@
       </w:tr>
       <w:tr>
         <w:trPr>
+          <w:trHeight w:val="963"/>
           <w:tblHeader/>
         </w:trPr>
         <w:tc>
@@ -17548,6 +17610,7 @@
       </w:tr>
       <w:tr>
         <w:trPr>
+          <w:trHeight w:val="963"/>
           <w:tblHeader/>
         </w:trPr>
         <w:tc>
@@ -17623,6 +17686,7 @@
       </w:tr>
       <w:tr>
         <w:trPr>
+          <w:trHeight w:val="963"/>
           <w:tblHeader/>
         </w:trPr>
         <w:tc>
@@ -18331,18 +18395,19 @@
     <w:tbl>
       <w:tblPr>
         <w:tblStyle w:val="TableGrid"/>
-        <w:tblW w:w="0" w:type="auto"/>
+        <w:tblW w:w="10086" w:type="dxa"/>
         <w:tblLook w:val="04A0" w:firstRow="1" w:lastRow="0" w:firstColumn="1" w:lastColumn="0" w:noHBand="0" w:noVBand="1"/>
       </w:tblPr>
       <w:tblGrid>
-        <w:gridCol w:w="1177"/>
-        <w:gridCol w:w="1321"/>
-        <w:gridCol w:w="986"/>
-        <w:gridCol w:w="1243"/>
-        <w:gridCol w:w="1243"/>
+        <w:gridCol w:w="1988"/>
+        <w:gridCol w:w="2232"/>
+        <w:gridCol w:w="1666"/>
+        <w:gridCol w:w="2100"/>
+        <w:gridCol w:w="2100"/>
       </w:tblGrid>
       <w:tr>
         <w:trPr>
+          <w:trHeight w:val="957"/>
           <w:tblHeader/>
         </w:trPr>
         <w:tc>
@@ -18454,6 +18519,7 @@
       </w:tr>
       <w:tr>
         <w:trPr>
+          <w:trHeight w:val="957"/>
           <w:tblHeader/>
         </w:trPr>
         <w:tc>
@@ -18522,6 +18588,7 @@
       </w:tr>
       <w:tr>
         <w:trPr>
+          <w:trHeight w:val="957"/>
           <w:tblHeader/>
         </w:trPr>
         <w:tc>
@@ -18582,6 +18649,7 @@
       </w:tr>
       <w:tr>
         <w:trPr>
+          <w:trHeight w:val="957"/>
           <w:tblHeader/>
         </w:trPr>
         <w:tc>
@@ -18642,6 +18710,7 @@
       </w:tr>
       <w:tr>
         <w:trPr>
+          <w:trHeight w:val="957"/>
           <w:tblHeader/>
         </w:trPr>
         <w:tc>
@@ -18702,6 +18771,7 @@
       </w:tr>
       <w:tr>
         <w:trPr>
+          <w:trHeight w:val="957"/>
           <w:tblHeader/>
         </w:trPr>
         <w:tc>
@@ -18762,6 +18832,7 @@
       </w:tr>
       <w:tr>
         <w:trPr>
+          <w:trHeight w:val="957"/>
           <w:tblHeader/>
         </w:trPr>
         <w:tc>
@@ -18822,6 +18893,7 @@
       </w:tr>
       <w:tr>
         <w:trPr>
+          <w:trHeight w:val="957"/>
           <w:tblHeader/>
         </w:trPr>
         <w:tc>
@@ -18882,6 +18954,7 @@
       </w:tr>
       <w:tr>
         <w:trPr>
+          <w:trHeight w:val="957"/>
           <w:tblHeader/>
         </w:trPr>
         <w:tc>
@@ -18942,6 +19015,7 @@
       </w:tr>
       <w:tr>
         <w:trPr>
+          <w:trHeight w:val="957"/>
           <w:tblHeader/>
         </w:trPr>
         <w:tc>
@@ -19002,6 +19076,7 @@
       </w:tr>
       <w:tr>
         <w:trPr>
+          <w:trHeight w:val="944"/>
           <w:tblHeader/>
         </w:trPr>
         <w:tc>
@@ -19100,15 +19175,16 @@
     <w:tbl>
       <w:tblPr>
         <w:tblStyle w:val="TableGrid"/>
-        <w:tblW w:w="0" w:type="auto"/>
+        <w:tblW w:w="10187" w:type="dxa"/>
         <w:tblLook w:val="04A0" w:firstRow="1" w:lastRow="0" w:firstColumn="1" w:lastColumn="0" w:noHBand="0" w:noVBand="1"/>
       </w:tblPr>
       <w:tblGrid>
-        <w:gridCol w:w="1477"/>
-        <w:gridCol w:w="1017"/>
+        <w:gridCol w:w="6033"/>
+        <w:gridCol w:w="4154"/>
       </w:tblGrid>
       <w:tr>
         <w:trPr>
+          <w:trHeight w:val="1038"/>
           <w:tblHeader/>
         </w:trPr>
         <w:tc>
@@ -19156,6 +19232,7 @@
       </w:tr>
       <w:tr>
         <w:trPr>
+          <w:trHeight w:val="1038"/>
           <w:tblHeader/>
         </w:trPr>
         <w:tc>
@@ -19187,6 +19264,7 @@
       </w:tr>
       <w:tr>
         <w:trPr>
+          <w:trHeight w:val="1038"/>
           <w:tblHeader/>
         </w:trPr>
         <w:tc>
@@ -19230,19 +19308,20 @@
     <w:tbl>
       <w:tblPr>
         <w:tblStyle w:val="TableGrid"/>
-        <w:tblW w:w="0" w:type="auto"/>
+        <w:tblW w:w="10193" w:type="dxa"/>
         <w:tblLook w:val="04A0" w:firstRow="1" w:lastRow="0" w:firstColumn="1" w:lastColumn="0" w:noHBand="0" w:noVBand="1"/>
       </w:tblPr>
       <w:tblGrid>
-        <w:gridCol w:w="2387"/>
-        <w:gridCol w:w="1177"/>
-        <w:gridCol w:w="1321"/>
-        <w:gridCol w:w="986"/>
-        <w:gridCol w:w="1243"/>
-        <w:gridCol w:w="1243"/>
+        <w:gridCol w:w="2911"/>
+        <w:gridCol w:w="1436"/>
+        <w:gridCol w:w="1611"/>
+        <w:gridCol w:w="1203"/>
+        <w:gridCol w:w="1516"/>
+        <w:gridCol w:w="1516"/>
       </w:tblGrid>
       <w:tr>
         <w:trPr>
+          <w:trHeight w:val="946"/>
           <w:tblHeader/>
         </w:trPr>
         <w:tc>
@@ -19374,6 +19453,7 @@
       </w:tr>
       <w:tr>
         <w:trPr>
+          <w:trHeight w:val="946"/>
           <w:tblHeader/>
         </w:trPr>
         <w:tc>
@@ -19445,6 +19525,7 @@
       </w:tr>
       <w:tr>
         <w:trPr>
+          <w:trHeight w:val="946"/>
           <w:tblHeader/>
         </w:trPr>
         <w:tc>
@@ -19556,16 +19637,17 @@
     <w:tbl>
       <w:tblPr>
         <w:tblStyle w:val="TableGrid"/>
-        <w:tblW w:w="0" w:type="auto"/>
+        <w:tblW w:w="10066" w:type="dxa"/>
         <w:tblLook w:val="04A0" w:firstRow="1" w:lastRow="0" w:firstColumn="1" w:lastColumn="0" w:noHBand="0" w:noVBand="1"/>
       </w:tblPr>
       <w:tblGrid>
-        <w:gridCol w:w="2388"/>
-        <w:gridCol w:w="1721"/>
-        <w:gridCol w:w="1079"/>
+        <w:gridCol w:w="4633"/>
+        <w:gridCol w:w="3339"/>
+        <w:gridCol w:w="2094"/>
       </w:tblGrid>
       <w:tr>
         <w:trPr>
+          <w:trHeight w:val="982"/>
           <w:tblHeader/>
         </w:trPr>
         <w:tc>
@@ -19634,6 +19716,7 @@
       </w:tr>
       <w:tr>
         <w:trPr>
+          <w:trHeight w:val="982"/>
           <w:tblHeader/>
         </w:trPr>
         <w:tc>
@@ -19680,6 +19763,7 @@
       </w:tr>
       <w:tr>
         <w:trPr>
+          <w:trHeight w:val="982"/>
           <w:tblHeader/>
         </w:trPr>
         <w:tc>
@@ -20505,6 +20589,14 @@
             </a:graphic>
           </wp:inline>
         </w:drawing>
+      </w:r>
+    </w:p>
+    <w:p>
+      <w:pPr>
+        <w:pStyle w:val="Caption"/>
+      </w:pPr>
+      <w:r>
+        <w:t>Hình 5.1 Bảng phân công công việc</w:t>
       </w:r>
     </w:p>
     <w:p>
@@ -20580,6 +20672,14 @@
     </w:p>
     <w:p>
       <w:pPr>
+        <w:pStyle w:val="Caption"/>
+      </w:pPr>
+      <w:r>
+        <w:t>Hình 5.2 Sơ đồ git quản lý mã nguồn chung</w:t>
+      </w:r>
+    </w:p>
+    <w:p>
+      <w:pPr>
         <w:pStyle w:val="Heading3"/>
       </w:pPr>
       <w:r>
@@ -20606,11 +20706,8 @@
     </w:p>
     <w:p>
       <w:r>
-        <w:t xml:space="preserve">Nhánh main được bảo vệ bằng GitHub Ruleset. Quy trình này ngăn việc push trực tiếp, yêu cầu thay đổi đi qua Pull Request và chỉ cho phép trưởng nhóm hợp nhất sau khi kiểm tra. </w:t>
-      </w:r>
-      <w:r>
         <w:lastRenderedPageBreak/>
-        <w:t>Nhờ đó, nhóm có thể kiểm soát chất lượng mã nguồn và dễ dàng truy vết lịch sử phát triển của dự án.</w:t>
+        <w:t>Nhánh main được bảo vệ bằng GitHub Ruleset. Quy trình này ngăn việc push trực tiếp, yêu cầu thay đổi đi qua Pull Request và chỉ cho phép trưởng nhóm hợp nhất sau khi kiểm tra. Nhờ đó, nhóm có thể kiểm soát chất lượng mã nguồn và dễ dàng truy vết lịch sử phát triển của dự án.</w:t>
       </w:r>
     </w:p>
     <w:p>
@@ -21016,19 +21113,20 @@
     <w:tbl>
       <w:tblPr>
         <w:tblStyle w:val="TableGrid"/>
-        <w:tblW w:w="0" w:type="auto"/>
+        <w:tblW w:w="10156" w:type="dxa"/>
         <w:tblLook w:val="04A0" w:firstRow="1" w:lastRow="0" w:firstColumn="1" w:lastColumn="0" w:noHBand="0" w:noVBand="1"/>
       </w:tblPr>
       <w:tblGrid>
-        <w:gridCol w:w="2674"/>
-        <w:gridCol w:w="1539"/>
-        <w:gridCol w:w="1290"/>
-        <w:gridCol w:w="1321"/>
-        <w:gridCol w:w="986"/>
-        <w:gridCol w:w="1243"/>
+        <w:gridCol w:w="3000"/>
+        <w:gridCol w:w="1727"/>
+        <w:gridCol w:w="1447"/>
+        <w:gridCol w:w="1482"/>
+        <w:gridCol w:w="1106"/>
+        <w:gridCol w:w="1394"/>
       </w:tblGrid>
       <w:tr>
         <w:trPr>
+          <w:trHeight w:val="1012"/>
           <w:tblHeader/>
         </w:trPr>
         <w:tc>
@@ -21161,6 +21259,7 @@
       </w:tr>
       <w:tr>
         <w:trPr>
+          <w:trHeight w:val="1012"/>
           <w:tblHeader/>
         </w:trPr>
         <w:tc>
@@ -21232,6 +21331,7 @@
       </w:tr>
       <w:tr>
         <w:trPr>
+          <w:trHeight w:val="1012"/>
           <w:tblHeader/>
         </w:trPr>
         <w:tc>
@@ -21303,6 +21403,7 @@
       </w:tr>
       <w:tr>
         <w:trPr>
+          <w:trHeight w:val="1012"/>
           <w:tblHeader/>
         </w:trPr>
         <w:tc>
@@ -21510,20 +21611,21 @@
     <w:tbl>
       <w:tblPr>
         <w:tblStyle w:val="TableGrid"/>
-        <w:tblW w:w="0" w:type="auto"/>
+        <w:tblW w:w="10148" w:type="dxa"/>
         <w:tblLook w:val="04A0" w:firstRow="1" w:lastRow="0" w:firstColumn="1" w:lastColumn="0" w:noHBand="0" w:noVBand="1"/>
       </w:tblPr>
       <w:tblGrid>
-        <w:gridCol w:w="971"/>
-        <w:gridCol w:w="1539"/>
-        <w:gridCol w:w="1290"/>
-        <w:gridCol w:w="1321"/>
-        <w:gridCol w:w="986"/>
-        <w:gridCol w:w="1243"/>
-        <w:gridCol w:w="1243"/>
+        <w:gridCol w:w="1148"/>
+        <w:gridCol w:w="1817"/>
+        <w:gridCol w:w="1523"/>
+        <w:gridCol w:w="1560"/>
+        <w:gridCol w:w="1164"/>
+        <w:gridCol w:w="1468"/>
+        <w:gridCol w:w="1468"/>
       </w:tblGrid>
       <w:tr>
         <w:trPr>
+          <w:trHeight w:val="1052"/>
           <w:tblHeader/>
         </w:trPr>
         <w:tc>
@@ -21543,6 +21645,7 @@
                 <w:b/>
                 <w:bCs/>
               </w:rPr>
+              <w:lastRenderedPageBreak/>
               <w:t>Chỉ số</w:t>
             </w:r>
           </w:p>
@@ -21676,6 +21779,7 @@
       </w:tr>
       <w:tr>
         <w:trPr>
+          <w:trHeight w:val="1052"/>
           <w:tblHeader/>
         </w:trPr>
         <w:tc>
@@ -21783,7 +21887,6 @@
     </w:tbl>
     <w:p>
       <w:r>
-        <w:lastRenderedPageBreak/>
         <w:t>So với ngưỡng mặc định 0,5, ngưỡng 0,49 giúp Recall tăng từ 0,6829 lên 0,6964 và F2-score tăng từ 0,4413 lên 0,4417, trong khi Precision giảm nhẹ từ 0,1827 xuống 0,1793. Kết quả này phù hợp với định hướng nghiệp vụ của dự án là ưu tiên phát hiện thêm khách hàng có nguy cơ nợ xấu.</w:t>
       </w:r>
     </w:p>
@@ -21893,6 +21996,7 @@
       </w:pPr>
       <w:bookmarkStart w:id="30" w:name="_Toc237863803"/>
       <w:r>
+        <w:lastRenderedPageBreak/>
         <w:t>6.3. Hướng phát triển</w:t>
       </w:r>
       <w:bookmarkEnd w:id="30"/>
@@ -21904,37 +22008,33 @@
     </w:p>
     <w:p>
       <w:r>
+        <w:t>Trước hết, nhóm có thể thử nghiệm thêm các thuật toán phân loại khác như XGBoost, LightGBM hoặc CatBoost để so sánh với HistGradientBoosting hiện tại. Bên cạnh đó, có thể thực hiện Hyperparameter Tuning cho mô hình đang sử dụng, chẳng hạn điều chỉnh learning_rate, max_iter, max_leaf_nodes hoặc min_samples_leaf, nhằm cải thiện khả năng phân biệt khách hàng có nguy cơ nợ xấu.</w:t>
+      </w:r>
+    </w:p>
+    <w:p>
+      <w:r>
+        <w:t>Về dữ liệu, dự án có thể bổ sung thêm các feature phản ánh hành vi tín dụng gần thời điểm hiện tại, lịch sử thanh toán, mức sử dụng hạn mức và các chỉ số tài chính có ý nghĩa nghiệp vụ. Những feature mới cần tiếp tục được kiểm chứng bằng cùng pipeline và các metric phù hợp thay vì chỉ giữ lại dựa trên giả thuyết nghiệp vụ.</w:t>
+      </w:r>
+    </w:p>
+    <w:p>
+      <w:r>
+        <w:t>Khi có thêm dữ liệu thực tế theo thời gian, mô hình nên được huấn luyện và đánh giá lại để thích nghi với sự thay đổi trong hành vi vay và trả nợ của khách hàng. Việc mở rộng dữ liệu cũng giúp kiểm tra khả năng tổng quát hóa của mô hình tốt hơn so với chỉ sử dụng bộ dữ liệu ban đầu.</w:t>
+      </w:r>
+    </w:p>
+    <w:p>
+      <w:r>
+        <w:t>Một hướng phát triển quan trọng khác là mở rộng phần triển khai trong thư mục app. FastAPI có thể được bổ sung thêm các endpoint phục vụ tra cứu, kiểm tra trạng thái hệ thống, lưu lịch sử dự đoán hoặc quản lý phiên bản mô hình. Streamlit có thể được mở rộng để hiển thị xác suất rủi ro, mức cảnh báo, các thông tin liên quan đến hồ sơ khách hàng và lịch sử dự đoán theo cách trực quan hơn.</w:t>
+      </w:r>
+    </w:p>
+    <w:p>
+      <w:r>
+        <w:t>Dự án cũng có thể bổ sung các phương pháp giải thích mô hình như SHAP hoặc các kỹ thuật giải thích cục bộ để giúp người dùng hiểu vì sao một hồ sơ được đánh giá có mức rủi ro cao hoặc thấp. Tuy nhiên, các kết quả giải thích cần được sử dụng như công cụ hỗ trợ và không được diễn giải như quan hệ nguyên nhân trực tiếp.</w:t>
+      </w:r>
+    </w:p>
+    <w:p>
+      <w:r>
         <w:lastRenderedPageBreak/>
-        <w:t>Trước hết, nhóm có thể thử nghiệm thêm các thuật toán phân loại khác như XGBoost, LightGBM hoặc CatBoost để so sánh với HistGradientBoosting hiện tại. Bên cạnh đó, có thể thực hiện Hyperparameter Tuning cho mô hình đang sử dụng, chẳng hạn điều chỉnh learning_rate, max_iter, max_leaf_nodes hoặc min_samples_leaf, nhằm cải thiện khả năng phân biệt khách hàng có nguy cơ nợ xấu.</w:t>
-      </w:r>
-    </w:p>
-    <w:p>
-      <w:r>
-        <w:t>Về dữ liệu, dự án có thể bổ sung thêm các feature phản ánh hành vi tín dụng gần thời điểm hiện tại, lịch sử thanh toán, mức sử dụng hạn mức và các chỉ số tài chính có ý nghĩa nghiệp vụ. Những feature mới cần tiếp tục được kiểm chứng bằng cùng pipeline và các metric phù hợp thay vì chỉ giữ lại dựa trên giả thuyết nghiệp vụ.</w:t>
-      </w:r>
-    </w:p>
-    <w:p>
-      <w:r>
-        <w:t>Khi có thêm dữ liệu thực tế theo thời gian, mô hình nên được huấn luyện và đánh giá lại để thích nghi với sự thay đổi trong hành vi vay và trả nợ của khách hàng. Việc mở rộng dữ liệu cũng giúp kiểm tra khả năng tổng quát hóa của mô hình tốt hơn so với chỉ sử dụng bộ dữ liệu ban đầu.</w:t>
-      </w:r>
-    </w:p>
-    <w:p>
-      <w:r>
-        <w:t>Một hướng phát triển quan trọng khác là mở rộng phần triển khai trong thư mục app. FastAPI có thể được bổ sung thêm các endpoint phục vụ tra cứu, kiểm tra trạng thái hệ thống, lưu lịch sử dự đoán hoặc quản lý phiên bản mô hình. Streamlit có thể được mở rộng để hiển thị xác suất rủi ro, mức cảnh báo, các thông tin liên quan đến hồ sơ khách hàng và lịch sử dự đoán theo cách trực quan hơn.</w:t>
-      </w:r>
-    </w:p>
-    <w:p>
-      <w:r>
-        <w:t>Dự án cũng có thể bổ sung các phương pháp giải thích mô hình như SHAP hoặc các kỹ thuật giải thích cục bộ để giúp người dùng hiểu vì sao một hồ sơ được đánh giá có mức rủi ro cao hoặc thấp. Tuy nhiên, các kết quả giải thích cần được sử dụng như công cụ hỗ trợ và không được diễn giải như quan hệ nguyên nhân trực tiếp.</w:t>
-      </w:r>
-    </w:p>
-    <w:p>
-      <w:r>
-        <w:t xml:space="preserve">Sau khi triển khai, cần xây dựng cơ chế theo dõi định kỳ các chỉ số như ROC-AUC, PR-AUC, Precision, Recall, F1-score, F2-score và tỷ lệ nợ xấu thực tế. Đồng thời, nên theo dõi </w:t>
-      </w:r>
-      <w:r>
-        <w:lastRenderedPageBreak/>
-        <w:t xml:space="preserve">sự thay đổi của phân bố dữ liệu đầu vào để phát hiện </w:t>
+        <w:t xml:space="preserve">Sau khi triển khai, cần xây dựng cơ chế theo dõi định kỳ các chỉ số như ROC-AUC, PR-AUC, Precision, Recall, F1-score, F2-score và tỷ lệ nợ xấu thực tế. Đồng thời, nên theo dõi sự thay đổi của phân bố dữ liệu đầu vào để phát hiện </w:t>
       </w:r>
       <w:r>
         <w:rPr>
@@ -27424,6 +27524,7 @@
   <w:style w:type="character" w:default="1" w:styleId="DefaultParagraphFont">
     <w:name w:val="Default Paragraph Font"/>
     <w:uiPriority w:val="1"/>
+    <w:semiHidden/>
     <w:unhideWhenUsed/>
   </w:style>
   <w:style w:type="table" w:default="1" w:styleId="TableNormal">
@@ -27786,7 +27887,7 @@
     <w:next w:val="Normal"/>
     <w:unhideWhenUsed/>
     <w:qFormat/>
-    <w:rsid w:val="00D826B8"/>
+    <w:rsid w:val="00F1438A"/>
     <w:pPr>
       <w:spacing w:before="0" w:after="200" w:line="240" w:lineRule="auto"/>
       <w:jc w:val="center"/>
@@ -27794,7 +27895,6 @@
     <w:rPr>
       <w:i/>
       <w:iCs/>
-      <w:color w:val="44546A" w:themeColor="text2"/>
       <w:sz w:val="18"/>
       <w:szCs w:val="18"/>
     </w:rPr>

</xml_diff>